<commit_message>
Updated Threat Modeling Analysis Procedure (added note regarding model updates due to identified deficiencies)
</commit_message>
<xml_diff>
--- a/source/reference_documents/tertiary_documents/design/Threat Modeling/analysis/Threat Modeling - Analysis.docx
+++ b/source/reference_documents/tertiary_documents/design/Threat Modeling/analysis/Threat Modeling - Analysis.docx
@@ -43,7 +43,7 @@
         <w:t xml:space="preserve">Version </w:t>
       </w:r>
       <w:r>
-        <w:t>3</w:t>
+        <w:t>4</w:t>
       </w:r>
     </w:p>
     <w:p>
@@ -60,7 +60,7 @@
         <w:rPr>
           <w:noProof/>
         </w:rPr>
-        <w:t>4/8/25 9:06 AM</w:t>
+        <w:t>5/27/25 9:33 AM</w:t>
       </w:r>
       <w:r>
         <w:fldChar w:fldCharType="end"/>
@@ -1112,6 +1112,35 @@
       </w:r>
       <w:r>
         <w:t>.</w:t>
+      </w:r>
+    </w:p>
+    <w:p>
+      <w:pPr>
+        <w:ind w:left="720" w:hanging="720"/>
+      </w:pPr>
+      <w:r>
+        <w:rPr>
+          <w:b/>
+          <w:bCs/>
+          <w:color w:val="0070C0"/>
+        </w:rPr>
+        <w:t>Note:</w:t>
+      </w:r>
+      <w:r>
+        <w:tab/>
+        <w:t xml:space="preserve">If the analysis </w:t>
+      </w:r>
+      <w:r>
+        <w:t xml:space="preserve">exposes incomplete / incorrect information forming the model. The model will need to be </w:t>
+      </w:r>
+      <w:r>
+        <w:t>updated,</w:t>
+      </w:r>
+      <w:r>
+        <w:t xml:space="preserve"> and analysis redone</w:t>
+      </w:r>
+      <w:r>
+        <w:t>. No feedback flow is shown in the diagram because there are no steps between the threat model creation and the analysis activity.</w:t>
       </w:r>
     </w:p>
     <w:p>

</xml_diff>